<commit_message>
feat: generate numbered act and checklist
</commit_message>
<xml_diff>
--- a/templateActOfAcceptancePC.docx
+++ b/templateActOfAcceptancePC.docx
@@ -1,6 +1,6 @@
 
 <file path=word/document.xml><?xml version="1.0" encoding="utf-8"?>
-<w:document xmlns:wpc="http://schemas.microsoft.com/office/word/2010/wordprocessingCanvas" xmlns:cx="http://schemas.microsoft.com/office/drawing/2014/chartex" xmlns:cx1="http://schemas.microsoft.com/office/drawing/2015/9/8/chartex" xmlns:cx2="http://schemas.microsoft.com/office/drawing/2015/10/21/chartex" xmlns:cx3="http://schemas.microsoft.com/office/drawing/2016/5/9/chartex" xmlns:cx4="http://schemas.microsoft.com/office/drawing/2016/5/10/chartex" xmlns:cx5="http://schemas.microsoft.com/office/drawing/2016/5/11/chartex" xmlns:cx6="http://schemas.microsoft.com/office/drawing/2016/5/12/chartex" xmlns:cx7="http://schemas.microsoft.com/office/drawing/2016/5/13/chartex" xmlns:cx8="http://schemas.microsoft.com/office/drawing/2016/5/14/chartex" xmlns:mc="http://schemas.openxmlformats.org/markup-compatibility/2006" xmlns:aink="http://schemas.microsoft.com/office/drawing/2016/ink" xmlns:am3d="http://schemas.microsoft.com/office/drawing/2017/model3d" xmlns:o="urn:schemas-microsoft-com:office:office" xmlns:oel="http://schemas.microsoft.com/office/2019/extlst" xmlns:r="http://schemas.openxmlformats.org/officeDocument/2006/relationships" xmlns:m="http://schemas.openxmlformats.org/officeDocument/2006/math" xmlns:v="urn:schemas-microsoft-com:vml" xmlns:wp14="http://schemas.microsoft.com/office/word/2010/wordprocessingDrawing" xmlns:wp="http://schemas.openxmlformats.org/drawingml/2006/wordprocessingDrawing" xmlns:w10="urn:schemas-microsoft-com:office:word" xmlns:w="http://schemas.openxmlformats.org/wordprocessingml/2006/main" xmlns:w14="http://schemas.microsoft.com/office/word/2010/wordml" xmlns:w15="http://schemas.microsoft.com/office/word/2012/wordml" xmlns:w16cex="http://schemas.microsoft.com/office/word/2018/wordml/cex" xmlns:w16cid="http://schemas.microsoft.com/office/word/2016/wordml/cid" xmlns:w16="http://schemas.microsoft.com/office/word/2018/wordml" xmlns:w16du="http://schemas.microsoft.com/office/word/2023/wordml/word16du" xmlns:w16sdtdh="http://schemas.microsoft.com/office/word/2020/wordml/sdtdatahash" xmlns:w16sdtfl="http://schemas.microsoft.com/office/word/2024/wordml/sdtformatlock" xmlns:w16se="http://schemas.microsoft.com/office/word/2015/wordml/symex" xmlns:wpg="http://schemas.microsoft.com/office/word/2010/wordprocessingGroup" xmlns:wpi="http://schemas.microsoft.com/office/word/2010/wordprocessingInk" xmlns:wne="http://schemas.microsoft.com/office/word/2006/wordml" xmlns:wps="http://schemas.microsoft.com/office/word/2010/wordprocessingShape" mc:Ignorable="w14 w15 w16se w16cid w16 w16cex w16sdtdh w16sdtfl w16du wp14">
+<w:document xmlns:wpc="http://schemas.microsoft.com/office/word/2010/wordprocessingCanvas" xmlns:cx="http://schemas.microsoft.com/office/drawing/2014/chartex" xmlns:cx1="http://schemas.microsoft.com/office/drawing/2015/9/8/chartex" xmlns:cx2="http://schemas.microsoft.com/office/drawing/2015/10/21/chartex" xmlns:cx3="http://schemas.microsoft.com/office/drawing/2016/5/9/chartex" xmlns:cx4="http://schemas.microsoft.com/office/drawing/2016/5/10/chartex" xmlns:cx5="http://schemas.microsoft.com/office/drawing/2016/5/11/chartex" xmlns:cx6="http://schemas.microsoft.com/office/drawing/2016/5/12/chartex" xmlns:cx7="http://schemas.microsoft.com/office/drawing/2016/5/13/chartex" xmlns:cx8="http://schemas.microsoft.com/office/drawing/2016/5/14/chartex" xmlns:mc="http://schemas.openxmlformats.org/markup-compatibility/2006" xmlns:aink="http://schemas.microsoft.com/office/drawing/2016/ink" xmlns:am3d="http://schemas.microsoft.com/office/drawing/2017/model3d" xmlns:o="urn:schemas-microsoft-com:office:office" xmlns:oel="http://schemas.microsoft.com/office/2019/extlst" xmlns:r="http://schemas.openxmlformats.org/officeDocument/2006/relationships" xmlns:m="http://schemas.openxmlformats.org/officeDocument/2006/math" xmlns:v="urn:schemas-microsoft-com:vml" xmlns:wp14="http://schemas.microsoft.com/office/word/2010/wordprocessingDrawing" xmlns:wp="http://schemas.openxmlformats.org/drawingml/2006/wordprocessingDrawing" xmlns:w10="urn:schemas-microsoft-com:office:word" xmlns:w="http://schemas.openxmlformats.org/wordprocessingml/2006/main" xmlns:w14="http://schemas.microsoft.com/office/word/2010/wordml" xmlns:w15="http://schemas.microsoft.com/office/word/2012/wordml" xmlns:w16cex="http://schemas.microsoft.com/office/word/2018/wordml/cex" xmlns:w16cid="http://schemas.microsoft.com/office/word/2016/wordml/cid" xmlns:w16="http://schemas.microsoft.com/office/word/2018/wordml" xmlns:w16sdtdh="http://schemas.microsoft.com/office/word/2020/wordml/sdtdatahash" xmlns:w16se="http://schemas.microsoft.com/office/word/2015/wordml/symex" xmlns:wpg="http://schemas.microsoft.com/office/word/2010/wordprocessingGroup" xmlns:wpi="http://schemas.microsoft.com/office/word/2010/wordprocessingInk" xmlns:wne="http://schemas.microsoft.com/office/word/2006/wordml" xmlns:wps="http://schemas.microsoft.com/office/word/2010/wordprocessingShape" mc:Ignorable="w14 w15 w16se w16cid w16 w16cex w16sdtdh wp14">
   <w:body>
     <w:p>
       <w:pPr>
@@ -29,62 +29,58 @@
           <w:b/>
           <w:bCs/>
           <w:color w:val="FF0000"/>
+        </w:rPr>
+      </w:pPr>
+      <w:r>
+        <w:rPr>
+          <w:b/>
+          <w:bCs/>
+        </w:rPr>
+        <w:t>АКТ</w:t>
+      </w:r>
+      <w:r>
+        <w:rPr>
+          <w:b/>
+          <w:bCs/>
+        </w:rPr>
+        <w:t xml:space="preserve"> (</w:t>
+      </w:r>
+      <w:r>
+        <w:rPr>
+          <w:b/>
+          <w:bCs/>
+        </w:rPr>
+        <w:t>НАКЛАДНАЯ</w:t>
+      </w:r>
+      <w:r>
+        <w:rPr>
+          <w:b/>
+          <w:bCs/>
+        </w:rPr>
+        <w:t>) №</w:t>
+      </w:r>
+      <w:r>
+        <w:rPr>
+          <w:b/>
+          <w:bCs/>
+        </w:rPr>
+        <w:t xml:space="preserve"> </w:t>
+      </w:r>
+      <w:r>
+        <w:rPr>
+          <w:b/>
+          <w:bCs/>
           <w:lang w:val="en-US"/>
         </w:rPr>
-      </w:pPr>
-      <w:r>
-        <w:rPr>
-          <w:b/>
-          <w:bCs/>
-        </w:rPr>
-        <w:t>АКТ</w:t>
-      </w:r>
+        <w:t>{</w:t>
+      </w:r>
+      <w:proofErr w:type="spellStart"/>
       <w:r>
         <w:rPr>
           <w:b/>
           <w:bCs/>
           <w:lang w:val="en-US"/>
         </w:rPr>
-        <w:t xml:space="preserve"> (</w:t>
-      </w:r>
-      <w:r>
-        <w:rPr>
-          <w:b/>
-          <w:bCs/>
-        </w:rPr>
-        <w:t>НАКЛАДНАЯ</w:t>
-      </w:r>
-      <w:r>
-        <w:rPr>
-          <w:b/>
-          <w:bCs/>
-          <w:lang w:val="en-US"/>
-        </w:rPr>
-        <w:t>) №</w:t>
-      </w:r>
-      <w:r>
-        <w:rPr>
-          <w:b/>
-          <w:bCs/>
-          <w:lang w:val="en-US"/>
-        </w:rPr>
-        <w:t xml:space="preserve"> </w:t>
-      </w:r>
-      <w:r>
-        <w:rPr>
-          <w:b/>
-          <w:bCs/>
-          <w:lang w:val="en-US"/>
-        </w:rPr>
-        <w:t>[</w:t>
-      </w:r>
-      <w:proofErr w:type="spellStart"/>
-      <w:r>
-        <w:rPr>
-          <w:b/>
-          <w:bCs/>
-          <w:lang w:val="en-US"/>
-        </w:rPr>
         <w:t>actNumber</w:t>
       </w:r>
       <w:proofErr w:type="spellEnd"/>
@@ -92,9 +88,8 @@
         <w:rPr>
           <w:b/>
           <w:bCs/>
-          <w:lang w:val="en-US"/>
-        </w:rPr>
-        <w:t>]</w:t>
+        </w:rPr>
+        <w:t>}</w:t>
       </w:r>
     </w:p>
     <w:p>
@@ -185,11 +180,11 @@
         <w:tblLook w:val="01E0" w:firstRow="1" w:lastRow="1" w:firstColumn="1" w:lastColumn="1" w:noHBand="0" w:noVBand="0"/>
       </w:tblPr>
       <w:tblGrid>
-        <w:gridCol w:w="2062"/>
-        <w:gridCol w:w="2210"/>
-        <w:gridCol w:w="2124"/>
-        <w:gridCol w:w="2085"/>
-        <w:gridCol w:w="2256"/>
+        <w:gridCol w:w="2025"/>
+        <w:gridCol w:w="2200"/>
+        <w:gridCol w:w="2115"/>
+        <w:gridCol w:w="2070"/>
+        <w:gridCol w:w="2327"/>
       </w:tblGrid>
       <w:tr>
         <w:tc>
@@ -276,14 +271,12 @@
             </w:pPr>
             <w:bookmarkStart w:id="1" w:name="DEPT"/>
             <w:bookmarkEnd w:id="1"/>
-            <w:proofErr w:type="spellStart"/>
             <w:r>
               <w:rPr>
                 <w:lang w:val="en-US"/>
               </w:rPr>
-              <w:t>Adviros</w:t>
+              <w:t>PG</w:t>
             </w:r>
-            <w:proofErr w:type="spellEnd"/>
           </w:p>
         </w:tc>
         <w:tc>
@@ -302,7 +295,7 @@
               <w:rPr>
                 <w:lang w:val="en-US"/>
               </w:rPr>
-              <w:t>[</w:t>
+              <w:t>{</w:t>
             </w:r>
             <w:proofErr w:type="spellStart"/>
             <w:r>
@@ -316,7 +309,7 @@
               <w:rPr>
                 <w:lang w:val="en-US"/>
               </w:rPr>
-              <w:t>]</w:t>
+              <w:t>}</w:t>
             </w:r>
           </w:p>
         </w:tc>
@@ -336,7 +329,7 @@
               <w:rPr>
                 <w:lang w:val="en-US"/>
               </w:rPr>
-              <w:t>[</w:t>
+              <w:t>{</w:t>
             </w:r>
             <w:proofErr w:type="spellStart"/>
             <w:r>
@@ -350,7 +343,7 @@
               <w:rPr>
                 <w:lang w:val="en-US"/>
               </w:rPr>
-              <w:t>]</w:t>
+              <w:t>}</w:t>
             </w:r>
           </w:p>
         </w:tc>
@@ -370,7 +363,7 @@
               <w:rPr>
                 <w:lang w:val="en-US"/>
               </w:rPr>
-              <w:t>[</w:t>
+              <w:t>{</w:t>
             </w:r>
             <w:proofErr w:type="spellStart"/>
             <w:r>
@@ -384,7 +377,7 @@
               <w:rPr>
                 <w:lang w:val="en-US"/>
               </w:rPr>
-              <w:t>]</w:t>
+              <w:t>}</w:t>
             </w:r>
           </w:p>
         </w:tc>
@@ -404,7 +397,7 @@
               <w:rPr>
                 <w:lang w:val="en-US"/>
               </w:rPr>
-              <w:t>[</w:t>
+              <w:t>{</w:t>
             </w:r>
             <w:proofErr w:type="spellStart"/>
             <w:r>
@@ -418,7 +411,7 @@
               <w:rPr>
                 <w:lang w:val="en-US"/>
               </w:rPr>
-              <w:t>]</w:t>
+              <w:t>}</w:t>
             </w:r>
           </w:p>
         </w:tc>
@@ -475,7 +468,7 @@
         <w:rPr>
           <w:lang w:val="en-US"/>
         </w:rPr>
-        <w:t>[</w:t>
+        <w:t>{</w:t>
       </w:r>
       <w:proofErr w:type="spellStart"/>
       <w:r>
@@ -489,7 +482,7 @@
         <w:rPr>
           <w:lang w:val="en-US"/>
         </w:rPr>
-        <w:t>]</w:t>
+        <w:t>}</w:t>
       </w:r>
     </w:p>
     <w:p>
@@ -550,7 +543,7 @@
     <w:p>
       <w:pPr>
         <w:rPr>
-          <w:rStyle w:val="Emphasis"/>
+          <w:rStyle w:val="a5"/>
         </w:rPr>
       </w:pPr>
       <w:r>
@@ -561,13 +554,13 @@
       </w:r>
       <w:r>
         <w:rPr>
-          <w:rStyle w:val="Emphasis"/>
+          <w:rStyle w:val="a5"/>
         </w:rPr>
         <w:t>соответствует</w:t>
       </w:r>
       <w:r>
         <w:rPr>
-          <w:rStyle w:val="Emphasis"/>
+          <w:rStyle w:val="a5"/>
         </w:rPr>
         <w:t xml:space="preserve">: </w:t>
       </w:r>
@@ -575,14 +568,14 @@
     <w:p>
       <w:pPr>
         <w:rPr>
-          <w:rStyle w:val="Emphasis"/>
+          <w:rStyle w:val="a5"/>
         </w:rPr>
       </w:pPr>
     </w:p>
     <w:p>
       <w:pPr>
         <w:rPr>
-          <w:rStyle w:val="Emphasis"/>
+          <w:rStyle w:val="a5"/>
         </w:rPr>
       </w:pPr>
     </w:p>
@@ -610,7 +603,7 @@
           <w:b/>
           <w:bCs/>
         </w:rPr>
-        <w:t>[</w:t>
+        <w:t>{</w:t>
       </w:r>
       <w:proofErr w:type="spellStart"/>
       <w:r>
@@ -627,13 +620,7 @@
           <w:b/>
           <w:bCs/>
         </w:rPr>
-        <w:t>]</w:t>
-      </w:r>
-      <w:r>
-        <w:rPr>
-          <w:b/>
-        </w:rPr>
-        <w:t xml:space="preserve"> </w:t>
+        <w:t>}</w:t>
       </w:r>
     </w:p>
     <w:p>
@@ -699,7 +686,6 @@
       <w:pPr>
         <w:rPr>
           <w:b/>
-          <w:bCs/>
         </w:rPr>
       </w:pPr>
       <w:r>
@@ -712,8 +698,26 @@
       <w:r>
         <w:rPr>
           <w:b/>
-        </w:rPr>
-        <w:t>Бушин Андрей</w:t>
+          <w:bCs/>
+        </w:rPr>
+        <w:t>{</w:t>
+      </w:r>
+      <w:proofErr w:type="spellStart"/>
+      <w:r>
+        <w:rPr>
+          <w:b/>
+          <w:bCs/>
+          <w:lang w:val="en-US"/>
+        </w:rPr>
+        <w:t>issuedBy</w:t>
+      </w:r>
+      <w:proofErr w:type="spellEnd"/>
+      <w:r>
+        <w:rPr>
+          <w:b/>
+          <w:bCs/>
+        </w:rPr>
+        <w:t>}</w:t>
       </w:r>
     </w:p>
     <w:p>
@@ -855,26 +859,29 @@
         <w:jc w:val="right"/>
         <w:rPr>
           <w:bCs/>
+          <w:lang w:val="en-US"/>
         </w:rPr>
       </w:pPr>
       <w:r>
         <w:rPr>
           <w:bCs/>
-        </w:rPr>
-        <w:t>[</w:t>
-      </w:r>
-      <w:r>
-        <w:rPr>
-          <w:bCs/>
           <w:lang w:val="en-US"/>
         </w:rPr>
+        <w:t>{</w:t>
+      </w:r>
+      <w:r>
+        <w:rPr>
+          <w:bCs/>
+          <w:lang w:val="en-US"/>
+        </w:rPr>
         <w:t>date</w:t>
       </w:r>
       <w:r>
         <w:rPr>
           <w:bCs/>
-        </w:rPr>
-        <w:t>]</w:t>
+          <w:lang w:val="en-US"/>
+        </w:rPr>
+        <w:t>}</w:t>
       </w:r>
     </w:p>
     <w:sectPr>
@@ -892,7 +899,7 @@
 </file>
 
 <file path=word/endnotes.xml><?xml version="1.0" encoding="utf-8"?>
-<w:endnotes xmlns:wpc="http://schemas.microsoft.com/office/word/2010/wordprocessingCanvas" xmlns:cx="http://schemas.microsoft.com/office/drawing/2014/chartex" xmlns:cx1="http://schemas.microsoft.com/office/drawing/2015/9/8/chartex" xmlns:cx2="http://schemas.microsoft.com/office/drawing/2015/10/21/chartex" xmlns:cx3="http://schemas.microsoft.com/office/drawing/2016/5/9/chartex" xmlns:cx4="http://schemas.microsoft.com/office/drawing/2016/5/10/chartex" xmlns:cx5="http://schemas.microsoft.com/office/drawing/2016/5/11/chartex" xmlns:cx6="http://schemas.microsoft.com/office/drawing/2016/5/12/chartex" xmlns:cx7="http://schemas.microsoft.com/office/drawing/2016/5/13/chartex" xmlns:cx8="http://schemas.microsoft.com/office/drawing/2016/5/14/chartex" xmlns:mc="http://schemas.openxmlformats.org/markup-compatibility/2006" xmlns:aink="http://schemas.microsoft.com/office/drawing/2016/ink" xmlns:am3d="http://schemas.microsoft.com/office/drawing/2017/model3d" xmlns:o="urn:schemas-microsoft-com:office:office" xmlns:oel="http://schemas.microsoft.com/office/2019/extlst" xmlns:r="http://schemas.openxmlformats.org/officeDocument/2006/relationships" xmlns:m="http://schemas.openxmlformats.org/officeDocument/2006/math" xmlns:v="urn:schemas-microsoft-com:vml" xmlns:wp14="http://schemas.microsoft.com/office/word/2010/wordprocessingDrawing" xmlns:wp="http://schemas.openxmlformats.org/drawingml/2006/wordprocessingDrawing" xmlns:w10="urn:schemas-microsoft-com:office:word" xmlns:w="http://schemas.openxmlformats.org/wordprocessingml/2006/main" xmlns:w14="http://schemas.microsoft.com/office/word/2010/wordml" xmlns:w15="http://schemas.microsoft.com/office/word/2012/wordml" xmlns:w16cex="http://schemas.microsoft.com/office/word/2018/wordml/cex" xmlns:w16cid="http://schemas.microsoft.com/office/word/2016/wordml/cid" xmlns:w16="http://schemas.microsoft.com/office/word/2018/wordml" xmlns:w16du="http://schemas.microsoft.com/office/word/2023/wordml/word16du" xmlns:w16sdtdh="http://schemas.microsoft.com/office/word/2020/wordml/sdtdatahash" xmlns:w16sdtfl="http://schemas.microsoft.com/office/word/2024/wordml/sdtformatlock" xmlns:w16se="http://schemas.microsoft.com/office/word/2015/wordml/symex" xmlns:wpg="http://schemas.microsoft.com/office/word/2010/wordprocessingGroup" xmlns:wpi="http://schemas.microsoft.com/office/word/2010/wordprocessingInk" xmlns:wne="http://schemas.microsoft.com/office/word/2006/wordml" xmlns:wps="http://schemas.microsoft.com/office/word/2010/wordprocessingShape" mc:Ignorable="w14 w15 w16se w16cid w16 w16cex w16sdtdh w16sdtfl w16du wp14">
+<w:endnotes xmlns:wpc="http://schemas.microsoft.com/office/word/2010/wordprocessingCanvas" xmlns:cx="http://schemas.microsoft.com/office/drawing/2014/chartex" xmlns:cx1="http://schemas.microsoft.com/office/drawing/2015/9/8/chartex" xmlns:cx2="http://schemas.microsoft.com/office/drawing/2015/10/21/chartex" xmlns:cx3="http://schemas.microsoft.com/office/drawing/2016/5/9/chartex" xmlns:cx4="http://schemas.microsoft.com/office/drawing/2016/5/10/chartex" xmlns:cx5="http://schemas.microsoft.com/office/drawing/2016/5/11/chartex" xmlns:cx6="http://schemas.microsoft.com/office/drawing/2016/5/12/chartex" xmlns:cx7="http://schemas.microsoft.com/office/drawing/2016/5/13/chartex" xmlns:cx8="http://schemas.microsoft.com/office/drawing/2016/5/14/chartex" xmlns:mc="http://schemas.openxmlformats.org/markup-compatibility/2006" xmlns:aink="http://schemas.microsoft.com/office/drawing/2016/ink" xmlns:am3d="http://schemas.microsoft.com/office/drawing/2017/model3d" xmlns:o="urn:schemas-microsoft-com:office:office" xmlns:oel="http://schemas.microsoft.com/office/2019/extlst" xmlns:r="http://schemas.openxmlformats.org/officeDocument/2006/relationships" xmlns:m="http://schemas.openxmlformats.org/officeDocument/2006/math" xmlns:v="urn:schemas-microsoft-com:vml" xmlns:wp14="http://schemas.microsoft.com/office/word/2010/wordprocessingDrawing" xmlns:wp="http://schemas.openxmlformats.org/drawingml/2006/wordprocessingDrawing" xmlns:w10="urn:schemas-microsoft-com:office:word" xmlns:w="http://schemas.openxmlformats.org/wordprocessingml/2006/main" xmlns:w14="http://schemas.microsoft.com/office/word/2010/wordml" xmlns:w15="http://schemas.microsoft.com/office/word/2012/wordml" xmlns:w16cex="http://schemas.microsoft.com/office/word/2018/wordml/cex" xmlns:w16cid="http://schemas.microsoft.com/office/word/2016/wordml/cid" xmlns:w16="http://schemas.microsoft.com/office/word/2018/wordml" xmlns:w16sdtdh="http://schemas.microsoft.com/office/word/2020/wordml/sdtdatahash" xmlns:w16se="http://schemas.microsoft.com/office/word/2015/wordml/symex" xmlns:wpg="http://schemas.microsoft.com/office/word/2010/wordprocessingGroup" xmlns:wpi="http://schemas.microsoft.com/office/word/2010/wordprocessingInk" xmlns:wne="http://schemas.microsoft.com/office/word/2006/wordml" xmlns:wps="http://schemas.microsoft.com/office/word/2010/wordprocessingShape" mc:Ignorable="w14 w15 w16se w16cid w16 w16cex w16sdtdh wp14">
   <w:endnote w:type="separator" w:id="-1">
     <w:p>
       <w:r>
@@ -911,7 +918,7 @@
 </file>
 
 <file path=word/footnotes.xml><?xml version="1.0" encoding="utf-8"?>
-<w:footnotes xmlns:wpc="http://schemas.microsoft.com/office/word/2010/wordprocessingCanvas" xmlns:cx="http://schemas.microsoft.com/office/drawing/2014/chartex" xmlns:cx1="http://schemas.microsoft.com/office/drawing/2015/9/8/chartex" xmlns:cx2="http://schemas.microsoft.com/office/drawing/2015/10/21/chartex" xmlns:cx3="http://schemas.microsoft.com/office/drawing/2016/5/9/chartex" xmlns:cx4="http://schemas.microsoft.com/office/drawing/2016/5/10/chartex" xmlns:cx5="http://schemas.microsoft.com/office/drawing/2016/5/11/chartex" xmlns:cx6="http://schemas.microsoft.com/office/drawing/2016/5/12/chartex" xmlns:cx7="http://schemas.microsoft.com/office/drawing/2016/5/13/chartex" xmlns:cx8="http://schemas.microsoft.com/office/drawing/2016/5/14/chartex" xmlns:mc="http://schemas.openxmlformats.org/markup-compatibility/2006" xmlns:aink="http://schemas.microsoft.com/office/drawing/2016/ink" xmlns:am3d="http://schemas.microsoft.com/office/drawing/2017/model3d" xmlns:o="urn:schemas-microsoft-com:office:office" xmlns:oel="http://schemas.microsoft.com/office/2019/extlst" xmlns:r="http://schemas.openxmlformats.org/officeDocument/2006/relationships" xmlns:m="http://schemas.openxmlformats.org/officeDocument/2006/math" xmlns:v="urn:schemas-microsoft-com:vml" xmlns:wp14="http://schemas.microsoft.com/office/word/2010/wordprocessingDrawing" xmlns:wp="http://schemas.openxmlformats.org/drawingml/2006/wordprocessingDrawing" xmlns:w10="urn:schemas-microsoft-com:office:word" xmlns:w="http://schemas.openxmlformats.org/wordprocessingml/2006/main" xmlns:w14="http://schemas.microsoft.com/office/word/2010/wordml" xmlns:w15="http://schemas.microsoft.com/office/word/2012/wordml" xmlns:w16cex="http://schemas.microsoft.com/office/word/2018/wordml/cex" xmlns:w16cid="http://schemas.microsoft.com/office/word/2016/wordml/cid" xmlns:w16="http://schemas.microsoft.com/office/word/2018/wordml" xmlns:w16du="http://schemas.microsoft.com/office/word/2023/wordml/word16du" xmlns:w16sdtdh="http://schemas.microsoft.com/office/word/2020/wordml/sdtdatahash" xmlns:w16sdtfl="http://schemas.microsoft.com/office/word/2024/wordml/sdtformatlock" xmlns:w16se="http://schemas.microsoft.com/office/word/2015/wordml/symex" xmlns:wpg="http://schemas.microsoft.com/office/word/2010/wordprocessingGroup" xmlns:wpi="http://schemas.microsoft.com/office/word/2010/wordprocessingInk" xmlns:wne="http://schemas.microsoft.com/office/word/2006/wordml" xmlns:wps="http://schemas.microsoft.com/office/word/2010/wordprocessingShape" mc:Ignorable="w14 w15 w16se w16cid w16 w16cex w16sdtdh w16sdtfl w16du wp14">
+<w:footnotes xmlns:wpc="http://schemas.microsoft.com/office/word/2010/wordprocessingCanvas" xmlns:cx="http://schemas.microsoft.com/office/drawing/2014/chartex" xmlns:cx1="http://schemas.microsoft.com/office/drawing/2015/9/8/chartex" xmlns:cx2="http://schemas.microsoft.com/office/drawing/2015/10/21/chartex" xmlns:cx3="http://schemas.microsoft.com/office/drawing/2016/5/9/chartex" xmlns:cx4="http://schemas.microsoft.com/office/drawing/2016/5/10/chartex" xmlns:cx5="http://schemas.microsoft.com/office/drawing/2016/5/11/chartex" xmlns:cx6="http://schemas.microsoft.com/office/drawing/2016/5/12/chartex" xmlns:cx7="http://schemas.microsoft.com/office/drawing/2016/5/13/chartex" xmlns:cx8="http://schemas.microsoft.com/office/drawing/2016/5/14/chartex" xmlns:mc="http://schemas.openxmlformats.org/markup-compatibility/2006" xmlns:aink="http://schemas.microsoft.com/office/drawing/2016/ink" xmlns:am3d="http://schemas.microsoft.com/office/drawing/2017/model3d" xmlns:o="urn:schemas-microsoft-com:office:office" xmlns:oel="http://schemas.microsoft.com/office/2019/extlst" xmlns:r="http://schemas.openxmlformats.org/officeDocument/2006/relationships" xmlns:m="http://schemas.openxmlformats.org/officeDocument/2006/math" xmlns:v="urn:schemas-microsoft-com:vml" xmlns:wp14="http://schemas.microsoft.com/office/word/2010/wordprocessingDrawing" xmlns:wp="http://schemas.openxmlformats.org/drawingml/2006/wordprocessingDrawing" xmlns:w10="urn:schemas-microsoft-com:office:word" xmlns:w="http://schemas.openxmlformats.org/wordprocessingml/2006/main" xmlns:w14="http://schemas.microsoft.com/office/word/2010/wordml" xmlns:w15="http://schemas.microsoft.com/office/word/2012/wordml" xmlns:w16cex="http://schemas.microsoft.com/office/word/2018/wordml/cex" xmlns:w16cid="http://schemas.microsoft.com/office/word/2016/wordml/cid" xmlns:w16="http://schemas.microsoft.com/office/word/2018/wordml" xmlns:w16sdtdh="http://schemas.microsoft.com/office/word/2020/wordml/sdtdatahash" xmlns:w16se="http://schemas.microsoft.com/office/word/2015/wordml/symex" xmlns:wpg="http://schemas.microsoft.com/office/word/2010/wordprocessingGroup" xmlns:wpi="http://schemas.microsoft.com/office/word/2010/wordprocessingInk" xmlns:wne="http://schemas.microsoft.com/office/word/2006/wordml" xmlns:wps="http://schemas.microsoft.com/office/word/2010/wordprocessingShape" mc:Ignorable="w14 w15 w16se w16cid w16 w16cex w16sdtdh wp14">
   <w:footnote w:type="separator" w:id="-1">
     <w:p>
       <w:r>
@@ -930,10 +937,10 @@
 </file>
 
 <file path=word/header1.xml><?xml version="1.0" encoding="utf-8"?>
-<w:hdr xmlns:wpc="http://schemas.microsoft.com/office/word/2010/wordprocessingCanvas" xmlns:cx="http://schemas.microsoft.com/office/drawing/2014/chartex" xmlns:cx1="http://schemas.microsoft.com/office/drawing/2015/9/8/chartex" xmlns:cx2="http://schemas.microsoft.com/office/drawing/2015/10/21/chartex" xmlns:cx3="http://schemas.microsoft.com/office/drawing/2016/5/9/chartex" xmlns:cx4="http://schemas.microsoft.com/office/drawing/2016/5/10/chartex" xmlns:cx5="http://schemas.microsoft.com/office/drawing/2016/5/11/chartex" xmlns:cx6="http://schemas.microsoft.com/office/drawing/2016/5/12/chartex" xmlns:cx7="http://schemas.microsoft.com/office/drawing/2016/5/13/chartex" xmlns:cx8="http://schemas.microsoft.com/office/drawing/2016/5/14/chartex" xmlns:mc="http://schemas.openxmlformats.org/markup-compatibility/2006" xmlns:aink="http://schemas.microsoft.com/office/drawing/2016/ink" xmlns:am3d="http://schemas.microsoft.com/office/drawing/2017/model3d" xmlns:o="urn:schemas-microsoft-com:office:office" xmlns:oel="http://schemas.microsoft.com/office/2019/extlst" xmlns:r="http://schemas.openxmlformats.org/officeDocument/2006/relationships" xmlns:m="http://schemas.openxmlformats.org/officeDocument/2006/math" xmlns:v="urn:schemas-microsoft-com:vml" xmlns:wp14="http://schemas.microsoft.com/office/word/2010/wordprocessingDrawing" xmlns:wp="http://schemas.openxmlformats.org/drawingml/2006/wordprocessingDrawing" xmlns:w10="urn:schemas-microsoft-com:office:word" xmlns:w="http://schemas.openxmlformats.org/wordprocessingml/2006/main" xmlns:w14="http://schemas.microsoft.com/office/word/2010/wordml" xmlns:w15="http://schemas.microsoft.com/office/word/2012/wordml" xmlns:w16cex="http://schemas.microsoft.com/office/word/2018/wordml/cex" xmlns:w16cid="http://schemas.microsoft.com/office/word/2016/wordml/cid" xmlns:w16="http://schemas.microsoft.com/office/word/2018/wordml" xmlns:w16du="http://schemas.microsoft.com/office/word/2023/wordml/word16du" xmlns:w16sdtdh="http://schemas.microsoft.com/office/word/2020/wordml/sdtdatahash" xmlns:w16sdtfl="http://schemas.microsoft.com/office/word/2024/wordml/sdtformatlock" xmlns:w16se="http://schemas.microsoft.com/office/word/2015/wordml/symex" xmlns:wpg="http://schemas.microsoft.com/office/word/2010/wordprocessingGroup" xmlns:wpi="http://schemas.microsoft.com/office/word/2010/wordprocessingInk" xmlns:wne="http://schemas.microsoft.com/office/word/2006/wordml" xmlns:wps="http://schemas.microsoft.com/office/word/2010/wordprocessingShape" mc:Ignorable="w14 w15 w16se w16cid w16 w16cex w16sdtdh w16sdtfl w16du wp14">
+<w:hdr xmlns:wpc="http://schemas.microsoft.com/office/word/2010/wordprocessingCanvas" xmlns:cx="http://schemas.microsoft.com/office/drawing/2014/chartex" xmlns:cx1="http://schemas.microsoft.com/office/drawing/2015/9/8/chartex" xmlns:cx2="http://schemas.microsoft.com/office/drawing/2015/10/21/chartex" xmlns:cx3="http://schemas.microsoft.com/office/drawing/2016/5/9/chartex" xmlns:cx4="http://schemas.microsoft.com/office/drawing/2016/5/10/chartex" xmlns:cx5="http://schemas.microsoft.com/office/drawing/2016/5/11/chartex" xmlns:cx6="http://schemas.microsoft.com/office/drawing/2016/5/12/chartex" xmlns:cx7="http://schemas.microsoft.com/office/drawing/2016/5/13/chartex" xmlns:cx8="http://schemas.microsoft.com/office/drawing/2016/5/14/chartex" xmlns:mc="http://schemas.openxmlformats.org/markup-compatibility/2006" xmlns:aink="http://schemas.microsoft.com/office/drawing/2016/ink" xmlns:am3d="http://schemas.microsoft.com/office/drawing/2017/model3d" xmlns:o="urn:schemas-microsoft-com:office:office" xmlns:oel="http://schemas.microsoft.com/office/2019/extlst" xmlns:r="http://schemas.openxmlformats.org/officeDocument/2006/relationships" xmlns:m="http://schemas.openxmlformats.org/officeDocument/2006/math" xmlns:v="urn:schemas-microsoft-com:vml" xmlns:wp14="http://schemas.microsoft.com/office/word/2010/wordprocessingDrawing" xmlns:wp="http://schemas.openxmlformats.org/drawingml/2006/wordprocessingDrawing" xmlns:w10="urn:schemas-microsoft-com:office:word" xmlns:w="http://schemas.openxmlformats.org/wordprocessingml/2006/main" xmlns:w14="http://schemas.microsoft.com/office/word/2010/wordml" xmlns:w15="http://schemas.microsoft.com/office/word/2012/wordml" xmlns:w16cex="http://schemas.microsoft.com/office/word/2018/wordml/cex" xmlns:w16cid="http://schemas.microsoft.com/office/word/2016/wordml/cid" xmlns:w16="http://schemas.microsoft.com/office/word/2018/wordml" xmlns:w16sdtdh="http://schemas.microsoft.com/office/word/2020/wordml/sdtdatahash" xmlns:w16se="http://schemas.microsoft.com/office/word/2015/wordml/symex" xmlns:wpg="http://schemas.microsoft.com/office/word/2010/wordprocessingGroup" xmlns:wpi="http://schemas.microsoft.com/office/word/2010/wordprocessingInk" xmlns:wne="http://schemas.microsoft.com/office/word/2006/wordml" xmlns:wps="http://schemas.microsoft.com/office/word/2010/wordprocessingShape" mc:Ignorable="w14 w15 w16se w16cid w16 w16cex w16sdtdh wp14">
   <w:p>
     <w:pPr>
-      <w:pStyle w:val="Header"/>
+      <w:pStyle w:val="a6"/>
     </w:pPr>
     <w:r>
       <w:rPr>
@@ -1021,8 +1028,7 @@
               <v:stroke joinstyle="miter"/>
               <v:path gradientshapeok="t" o:connecttype="rect"/>
             </v:shapetype>
-            <v:shape id="Text Box 2" o:spid="_x0000_s1026" type="#_x0000_t202" alt="Business Use" style="position:absolute;margin-left:27.15pt;margin-top:0;width:78.35pt;height:27.2pt;z-index:251659264;visibility:visible;mso-wrap-style:none;mso-wrap-distance-left:0;mso-wrap-distance-top:0;mso-wrap-distance-right:0;mso-wrap-distance-bottom:0;mso-position-horizontal:right;mso-position-horizontal-relative:page;mso-position-vertical:top;mso-position-vertical-relative:page;v-text-anchor:top" o:gfxdata="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" filled="f" stroked="f">
-              <v:fill o:detectmouseclick="t"/>
+            <v:shape id="Text Box 2" o:spid="_x0000_s1026" type="#_x0000_t202" alt="Business Use" style="position:absolute;margin-left:27.15pt;margin-top:0;width:78.35pt;height:27.2pt;z-index:251659264;visibility:visible;mso-wrap-style:none;mso-wrap-distance-left:0;mso-wrap-distance-top:0;mso-wrap-distance-right:0;mso-wrap-distance-bottom:0;mso-position-horizontal:right;mso-position-horizontal-relative:page;mso-position-vertical:top;mso-position-vertical-relative:page;v-text-anchor:top" o:gfxdata="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" filled="f" stroked="f">
               <v:textbox style="mso-fit-shape-to-text:t" inset="0,15pt,20pt,0">
                 <w:txbxContent>
                   <w:p>
@@ -1059,10 +1065,10 @@
 </file>
 
 <file path=word/header2.xml><?xml version="1.0" encoding="utf-8"?>
-<w:hdr xmlns:wpc="http://schemas.microsoft.com/office/word/2010/wordprocessingCanvas" xmlns:cx="http://schemas.microsoft.com/office/drawing/2014/chartex" xmlns:cx1="http://schemas.microsoft.com/office/drawing/2015/9/8/chartex" xmlns:cx2="http://schemas.microsoft.com/office/drawing/2015/10/21/chartex" xmlns:cx3="http://schemas.microsoft.com/office/drawing/2016/5/9/chartex" xmlns:cx4="http://schemas.microsoft.com/office/drawing/2016/5/10/chartex" xmlns:cx5="http://schemas.microsoft.com/office/drawing/2016/5/11/chartex" xmlns:cx6="http://schemas.microsoft.com/office/drawing/2016/5/12/chartex" xmlns:cx7="http://schemas.microsoft.com/office/drawing/2016/5/13/chartex" xmlns:cx8="http://schemas.microsoft.com/office/drawing/2016/5/14/chartex" xmlns:mc="http://schemas.openxmlformats.org/markup-compatibility/2006" xmlns:aink="http://schemas.microsoft.com/office/drawing/2016/ink" xmlns:am3d="http://schemas.microsoft.com/office/drawing/2017/model3d" xmlns:o="urn:schemas-microsoft-com:office:office" xmlns:oel="http://schemas.microsoft.com/office/2019/extlst" xmlns:r="http://schemas.openxmlformats.org/officeDocument/2006/relationships" xmlns:m="http://schemas.openxmlformats.org/officeDocument/2006/math" xmlns:v="urn:schemas-microsoft-com:vml" xmlns:wp14="http://schemas.microsoft.com/office/word/2010/wordprocessingDrawing" xmlns:wp="http://schemas.openxmlformats.org/drawingml/2006/wordprocessingDrawing" xmlns:w10="urn:schemas-microsoft-com:office:word" xmlns:w="http://schemas.openxmlformats.org/wordprocessingml/2006/main" xmlns:w14="http://schemas.microsoft.com/office/word/2010/wordml" xmlns:w15="http://schemas.microsoft.com/office/word/2012/wordml" xmlns:w16cex="http://schemas.microsoft.com/office/word/2018/wordml/cex" xmlns:w16cid="http://schemas.microsoft.com/office/word/2016/wordml/cid" xmlns:w16="http://schemas.microsoft.com/office/word/2018/wordml" xmlns:w16du="http://schemas.microsoft.com/office/word/2023/wordml/word16du" xmlns:w16sdtdh="http://schemas.microsoft.com/office/word/2020/wordml/sdtdatahash" xmlns:w16sdtfl="http://schemas.microsoft.com/office/word/2024/wordml/sdtformatlock" xmlns:w16se="http://schemas.microsoft.com/office/word/2015/wordml/symex" xmlns:wpg="http://schemas.microsoft.com/office/word/2010/wordprocessingGroup" xmlns:wpi="http://schemas.microsoft.com/office/word/2010/wordprocessingInk" xmlns:wne="http://schemas.microsoft.com/office/word/2006/wordml" xmlns:wps="http://schemas.microsoft.com/office/word/2010/wordprocessingShape" mc:Ignorable="w14 w15 w16se w16cid w16 w16cex w16sdtdh w16sdtfl w16du wp14">
+<w:hdr xmlns:wpc="http://schemas.microsoft.com/office/word/2010/wordprocessingCanvas" xmlns:cx="http://schemas.microsoft.com/office/drawing/2014/chartex" xmlns:cx1="http://schemas.microsoft.com/office/drawing/2015/9/8/chartex" xmlns:cx2="http://schemas.microsoft.com/office/drawing/2015/10/21/chartex" xmlns:cx3="http://schemas.microsoft.com/office/drawing/2016/5/9/chartex" xmlns:cx4="http://schemas.microsoft.com/office/drawing/2016/5/10/chartex" xmlns:cx5="http://schemas.microsoft.com/office/drawing/2016/5/11/chartex" xmlns:cx6="http://schemas.microsoft.com/office/drawing/2016/5/12/chartex" xmlns:cx7="http://schemas.microsoft.com/office/drawing/2016/5/13/chartex" xmlns:cx8="http://schemas.microsoft.com/office/drawing/2016/5/14/chartex" xmlns:mc="http://schemas.openxmlformats.org/markup-compatibility/2006" xmlns:aink="http://schemas.microsoft.com/office/drawing/2016/ink" xmlns:am3d="http://schemas.microsoft.com/office/drawing/2017/model3d" xmlns:o="urn:schemas-microsoft-com:office:office" xmlns:oel="http://schemas.microsoft.com/office/2019/extlst" xmlns:r="http://schemas.openxmlformats.org/officeDocument/2006/relationships" xmlns:m="http://schemas.openxmlformats.org/officeDocument/2006/math" xmlns:v="urn:schemas-microsoft-com:vml" xmlns:wp14="http://schemas.microsoft.com/office/word/2010/wordprocessingDrawing" xmlns:wp="http://schemas.openxmlformats.org/drawingml/2006/wordprocessingDrawing" xmlns:w10="urn:schemas-microsoft-com:office:word" xmlns:w="http://schemas.openxmlformats.org/wordprocessingml/2006/main" xmlns:w14="http://schemas.microsoft.com/office/word/2010/wordml" xmlns:w15="http://schemas.microsoft.com/office/word/2012/wordml" xmlns:w16cex="http://schemas.microsoft.com/office/word/2018/wordml/cex" xmlns:w16cid="http://schemas.microsoft.com/office/word/2016/wordml/cid" xmlns:w16="http://schemas.microsoft.com/office/word/2018/wordml" xmlns:w16sdtdh="http://schemas.microsoft.com/office/word/2020/wordml/sdtdatahash" xmlns:w16se="http://schemas.microsoft.com/office/word/2015/wordml/symex" xmlns:wpg="http://schemas.microsoft.com/office/word/2010/wordprocessingGroup" xmlns:wpi="http://schemas.microsoft.com/office/word/2010/wordprocessingInk" xmlns:wne="http://schemas.microsoft.com/office/word/2006/wordml" xmlns:wps="http://schemas.microsoft.com/office/word/2010/wordprocessingShape" mc:Ignorable="w14 w15 w16se w16cid w16 w16cex w16sdtdh wp14">
   <w:p>
     <w:pPr>
-      <w:pStyle w:val="Header"/>
+      <w:pStyle w:val="a6"/>
     </w:pPr>
     <w:r>
       <w:rPr>
@@ -1150,8 +1156,7 @@
               <v:stroke joinstyle="miter"/>
               <v:path gradientshapeok="t" o:connecttype="rect"/>
             </v:shapetype>
-            <v:shape id="Text Box 3" o:spid="_x0000_s1027" type="#_x0000_t202" alt="Business Use" style="position:absolute;margin-left:27.15pt;margin-top:0;width:78.35pt;height:27.2pt;z-index:251660288;visibility:visible;mso-wrap-style:none;mso-wrap-distance-left:0;mso-wrap-distance-top:0;mso-wrap-distance-right:0;mso-wrap-distance-bottom:0;mso-position-horizontal:right;mso-position-horizontal-relative:page;mso-position-vertical:top;mso-position-vertical-relative:page;v-text-anchor:top" o:gfxdata="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" filled="f" stroked="f">
-              <v:fill o:detectmouseclick="t"/>
+            <v:shape id="Text Box 3" o:spid="_x0000_s1027" type="#_x0000_t202" alt="Business Use" style="position:absolute;margin-left:27.15pt;margin-top:0;width:78.35pt;height:27.2pt;z-index:251660288;visibility:visible;mso-wrap-style:none;mso-wrap-distance-left:0;mso-wrap-distance-top:0;mso-wrap-distance-right:0;mso-wrap-distance-bottom:0;mso-position-horizontal:right;mso-position-horizontal-relative:page;mso-position-vertical:top;mso-position-vertical-relative:page;v-text-anchor:top" o:gfxdata="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" filled="f" stroked="f">
               <v:textbox style="mso-fit-shape-to-text:t" inset="0,15pt,20pt,0">
                 <w:txbxContent>
                   <w:p>
@@ -1188,10 +1193,10 @@
 </file>
 
 <file path=word/header3.xml><?xml version="1.0" encoding="utf-8"?>
-<w:hdr xmlns:wpc="http://schemas.microsoft.com/office/word/2010/wordprocessingCanvas" xmlns:cx="http://schemas.microsoft.com/office/drawing/2014/chartex" xmlns:cx1="http://schemas.microsoft.com/office/drawing/2015/9/8/chartex" xmlns:cx2="http://schemas.microsoft.com/office/drawing/2015/10/21/chartex" xmlns:cx3="http://schemas.microsoft.com/office/drawing/2016/5/9/chartex" xmlns:cx4="http://schemas.microsoft.com/office/drawing/2016/5/10/chartex" xmlns:cx5="http://schemas.microsoft.com/office/drawing/2016/5/11/chartex" xmlns:cx6="http://schemas.microsoft.com/office/drawing/2016/5/12/chartex" xmlns:cx7="http://schemas.microsoft.com/office/drawing/2016/5/13/chartex" xmlns:cx8="http://schemas.microsoft.com/office/drawing/2016/5/14/chartex" xmlns:mc="http://schemas.openxmlformats.org/markup-compatibility/2006" xmlns:aink="http://schemas.microsoft.com/office/drawing/2016/ink" xmlns:am3d="http://schemas.microsoft.com/office/drawing/2017/model3d" xmlns:o="urn:schemas-microsoft-com:office:office" xmlns:oel="http://schemas.microsoft.com/office/2019/extlst" xmlns:r="http://schemas.openxmlformats.org/officeDocument/2006/relationships" xmlns:m="http://schemas.openxmlformats.org/officeDocument/2006/math" xmlns:v="urn:schemas-microsoft-com:vml" xmlns:wp14="http://schemas.microsoft.com/office/word/2010/wordprocessingDrawing" xmlns:wp="http://schemas.openxmlformats.org/drawingml/2006/wordprocessingDrawing" xmlns:w10="urn:schemas-microsoft-com:office:word" xmlns:w="http://schemas.openxmlformats.org/wordprocessingml/2006/main" xmlns:w14="http://schemas.microsoft.com/office/word/2010/wordml" xmlns:w15="http://schemas.microsoft.com/office/word/2012/wordml" xmlns:w16cex="http://schemas.microsoft.com/office/word/2018/wordml/cex" xmlns:w16cid="http://schemas.microsoft.com/office/word/2016/wordml/cid" xmlns:w16="http://schemas.microsoft.com/office/word/2018/wordml" xmlns:w16du="http://schemas.microsoft.com/office/word/2023/wordml/word16du" xmlns:w16sdtdh="http://schemas.microsoft.com/office/word/2020/wordml/sdtdatahash" xmlns:w16sdtfl="http://schemas.microsoft.com/office/word/2024/wordml/sdtformatlock" xmlns:w16se="http://schemas.microsoft.com/office/word/2015/wordml/symex" xmlns:wpg="http://schemas.microsoft.com/office/word/2010/wordprocessingGroup" xmlns:wpi="http://schemas.microsoft.com/office/word/2010/wordprocessingInk" xmlns:wne="http://schemas.microsoft.com/office/word/2006/wordml" xmlns:wps="http://schemas.microsoft.com/office/word/2010/wordprocessingShape" mc:Ignorable="w14 w15 w16se w16cid w16 w16cex w16sdtdh w16sdtfl w16du wp14">
+<w:hdr xmlns:wpc="http://schemas.microsoft.com/office/word/2010/wordprocessingCanvas" xmlns:cx="http://schemas.microsoft.com/office/drawing/2014/chartex" xmlns:cx1="http://schemas.microsoft.com/office/drawing/2015/9/8/chartex" xmlns:cx2="http://schemas.microsoft.com/office/drawing/2015/10/21/chartex" xmlns:cx3="http://schemas.microsoft.com/office/drawing/2016/5/9/chartex" xmlns:cx4="http://schemas.microsoft.com/office/drawing/2016/5/10/chartex" xmlns:cx5="http://schemas.microsoft.com/office/drawing/2016/5/11/chartex" xmlns:cx6="http://schemas.microsoft.com/office/drawing/2016/5/12/chartex" xmlns:cx7="http://schemas.microsoft.com/office/drawing/2016/5/13/chartex" xmlns:cx8="http://schemas.microsoft.com/office/drawing/2016/5/14/chartex" xmlns:mc="http://schemas.openxmlformats.org/markup-compatibility/2006" xmlns:aink="http://schemas.microsoft.com/office/drawing/2016/ink" xmlns:am3d="http://schemas.microsoft.com/office/drawing/2017/model3d" xmlns:o="urn:schemas-microsoft-com:office:office" xmlns:oel="http://schemas.microsoft.com/office/2019/extlst" xmlns:r="http://schemas.openxmlformats.org/officeDocument/2006/relationships" xmlns:m="http://schemas.openxmlformats.org/officeDocument/2006/math" xmlns:v="urn:schemas-microsoft-com:vml" xmlns:wp14="http://schemas.microsoft.com/office/word/2010/wordprocessingDrawing" xmlns:wp="http://schemas.openxmlformats.org/drawingml/2006/wordprocessingDrawing" xmlns:w10="urn:schemas-microsoft-com:office:word" xmlns:w="http://schemas.openxmlformats.org/wordprocessingml/2006/main" xmlns:w14="http://schemas.microsoft.com/office/word/2010/wordml" xmlns:w15="http://schemas.microsoft.com/office/word/2012/wordml" xmlns:w16cex="http://schemas.microsoft.com/office/word/2018/wordml/cex" xmlns:w16cid="http://schemas.microsoft.com/office/word/2016/wordml/cid" xmlns:w16="http://schemas.microsoft.com/office/word/2018/wordml" xmlns:w16sdtdh="http://schemas.microsoft.com/office/word/2020/wordml/sdtdatahash" xmlns:w16se="http://schemas.microsoft.com/office/word/2015/wordml/symex" xmlns:wpg="http://schemas.microsoft.com/office/word/2010/wordprocessingGroup" xmlns:wpi="http://schemas.microsoft.com/office/word/2010/wordprocessingInk" xmlns:wne="http://schemas.microsoft.com/office/word/2006/wordml" xmlns:wps="http://schemas.microsoft.com/office/word/2010/wordprocessingShape" mc:Ignorable="w14 w15 w16se w16cid w16 w16cex w16sdtdh wp14">
   <w:p>
     <w:pPr>
-      <w:pStyle w:val="Header"/>
+      <w:pStyle w:val="a6"/>
     </w:pPr>
     <w:r>
       <w:rPr>
@@ -1279,8 +1284,7 @@
               <v:stroke joinstyle="miter"/>
               <v:path gradientshapeok="t" o:connecttype="rect"/>
             </v:shapetype>
-            <v:shape id="Text Box 1" o:spid="_x0000_s1028" type="#_x0000_t202" alt="Business Use" style="position:absolute;margin-left:27.15pt;margin-top:0;width:78.35pt;height:27.2pt;z-index:251658240;visibility:visible;mso-wrap-style:none;mso-wrap-distance-left:0;mso-wrap-distance-top:0;mso-wrap-distance-right:0;mso-wrap-distance-bottom:0;mso-position-horizontal:right;mso-position-horizontal-relative:page;mso-position-vertical:top;mso-position-vertical-relative:page;v-text-anchor:top" o:gfxdata="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" filled="f" stroked="f">
-              <v:fill o:detectmouseclick="t"/>
+            <v:shape id="Text Box 1" o:spid="_x0000_s1028" type="#_x0000_t202" alt="Business Use" style="position:absolute;margin-left:27.15pt;margin-top:0;width:78.35pt;height:27.2pt;z-index:251658240;visibility:visible;mso-wrap-style:none;mso-wrap-distance-left:0;mso-wrap-distance-top:0;mso-wrap-distance-right:0;mso-wrap-distance-bottom:0;mso-position-horizontal:right;mso-position-horizontal-relative:page;mso-position-vertical:top;mso-position-vertical-relative:page;v-text-anchor:top" o:gfxdata="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" filled="f" stroked="f">
               <v:textbox style="mso-fit-shape-to-text:t" inset="0,15pt,20pt,0">
                 <w:txbxContent>
                   <w:p>
@@ -1317,7 +1321,7 @@
 </file>
 
 <file path=word/styles.xml><?xml version="1.0" encoding="utf-8"?>
-<w:styles xmlns:mc="http://schemas.openxmlformats.org/markup-compatibility/2006" xmlns:r="http://schemas.openxmlformats.org/officeDocument/2006/relationships" xmlns:w="http://schemas.openxmlformats.org/wordprocessingml/2006/main" xmlns:w14="http://schemas.microsoft.com/office/word/2010/wordml" xmlns:w15="http://schemas.microsoft.com/office/word/2012/wordml" xmlns:w16cex="http://schemas.microsoft.com/office/word/2018/wordml/cex" xmlns:w16cid="http://schemas.microsoft.com/office/word/2016/wordml/cid" xmlns:w16="http://schemas.microsoft.com/office/word/2018/wordml" xmlns:w16du="http://schemas.microsoft.com/office/word/2023/wordml/word16du" xmlns:w16sdtdh="http://schemas.microsoft.com/office/word/2020/wordml/sdtdatahash" xmlns:w16sdtfl="http://schemas.microsoft.com/office/word/2024/wordml/sdtformatlock" xmlns:w16se="http://schemas.microsoft.com/office/word/2015/wordml/symex" mc:Ignorable="w14 w15 w16se w16cid w16 w16cex w16sdtdh w16sdtfl w16du">
+<w:styles xmlns:mc="http://schemas.openxmlformats.org/markup-compatibility/2006" xmlns:r="http://schemas.openxmlformats.org/officeDocument/2006/relationships" xmlns:w="http://schemas.openxmlformats.org/wordprocessingml/2006/main" xmlns:w14="http://schemas.microsoft.com/office/word/2010/wordml" xmlns:w15="http://schemas.microsoft.com/office/word/2012/wordml" xmlns:w16cex="http://schemas.microsoft.com/office/word/2018/wordml/cex" xmlns:w16cid="http://schemas.microsoft.com/office/word/2016/wordml/cid" xmlns:w16="http://schemas.microsoft.com/office/word/2018/wordml" xmlns:w16sdtdh="http://schemas.microsoft.com/office/word/2020/wordml/sdtdatahash" xmlns:w16se="http://schemas.microsoft.com/office/word/2015/wordml/symex" mc:Ignorable="w14 w15 w16se w16cid w16 w16cex w16sdtdh">
   <w:docDefaults>
     <w:rPrDefault>
       <w:rPr>
@@ -1698,7 +1702,7 @@
     <w:lsdException w:name="Unresolved Mention" w:semiHidden="1" w:uiPriority="99" w:unhideWhenUsed="1"/>
     <w:lsdException w:name="Smart Link" w:semiHidden="1" w:uiPriority="99" w:unhideWhenUsed="1"/>
   </w:latentStyles>
-  <w:style w:type="paragraph" w:default="1" w:styleId="Normal">
+  <w:style w:type="paragraph" w:default="1" w:styleId="a">
     <w:name w:val="Normal"/>
     <w:qFormat/>
     <w:rsid w:val="00842A9B"/>
@@ -1708,13 +1712,12 @@
       <w:lang w:val="ru-RU" w:eastAsia="ru-RU"/>
     </w:rPr>
   </w:style>
-  <w:style w:type="character" w:default="1" w:styleId="DefaultParagraphFont">
+  <w:style w:type="character" w:default="1" w:styleId="a0">
     <w:name w:val="Default Paragraph Font"/>
     <w:uiPriority w:val="1"/>
-    <w:semiHidden/>
     <w:unhideWhenUsed/>
   </w:style>
-  <w:style w:type="table" w:default="1" w:styleId="TableNormal">
+  <w:style w:type="table" w:default="1" w:styleId="a1">
     <w:name w:val="Normal Table"/>
     <w:uiPriority w:val="99"/>
     <w:semiHidden/>
@@ -1729,15 +1732,15 @@
       </w:tblCellMar>
     </w:tblPr>
   </w:style>
-  <w:style w:type="numbering" w:default="1" w:styleId="NoList">
+  <w:style w:type="numbering" w:default="1" w:styleId="a2">
     <w:name w:val="No List"/>
     <w:uiPriority w:val="99"/>
     <w:semiHidden/>
     <w:unhideWhenUsed/>
   </w:style>
-  <w:style w:type="table" w:styleId="TableGrid">
+  <w:style w:type="table" w:styleId="a3">
     <w:name w:val="Table Grid"/>
-    <w:basedOn w:val="TableNormal"/>
+    <w:basedOn w:val="a1"/>
     <w:rsid w:val="003A33D9"/>
     <w:tblPr>
       <w:tblBorders>
@@ -1750,9 +1753,9 @@
       </w:tblBorders>
     </w:tblPr>
   </w:style>
-  <w:style w:type="paragraph" w:styleId="BalloonText">
+  <w:style w:type="paragraph" w:styleId="a4">
     <w:name w:val="Balloon Text"/>
-    <w:basedOn w:val="Normal"/>
+    <w:basedOn w:val="a"/>
     <w:semiHidden/>
     <w:rsid w:val="008E19DF"/>
     <w:rPr>
@@ -1761,9 +1764,9 @@
       <w:szCs w:val="16"/>
     </w:rPr>
   </w:style>
-  <w:style w:type="character" w:styleId="Emphasis">
+  <w:style w:type="character" w:styleId="a5">
     <w:name w:val="Emphasis"/>
-    <w:basedOn w:val="DefaultParagraphFont"/>
+    <w:basedOn w:val="a0"/>
     <w:qFormat/>
     <w:rsid w:val="007B51DA"/>
     <w:rPr>
@@ -1771,10 +1774,10 @@
       <w:iCs/>
     </w:rPr>
   </w:style>
-  <w:style w:type="paragraph" w:styleId="Header">
+  <w:style w:type="paragraph" w:styleId="a6">
     <w:name w:val="header"/>
-    <w:basedOn w:val="Normal"/>
-    <w:link w:val="HeaderChar"/>
+    <w:basedOn w:val="a"/>
+    <w:link w:val="a7"/>
     <w:unhideWhenUsed/>
     <w:rsid w:val="00A336CE"/>
     <w:pPr>
@@ -1784,10 +1787,10 @@
       </w:tabs>
     </w:pPr>
   </w:style>
-  <w:style w:type="character" w:customStyle="1" w:styleId="HeaderChar">
-    <w:name w:val="Header Char"/>
-    <w:basedOn w:val="DefaultParagraphFont"/>
-    <w:link w:val="Header"/>
+  <w:style w:type="character" w:customStyle="1" w:styleId="a7">
+    <w:name w:val="Верхний колонтитул Знак"/>
+    <w:basedOn w:val="a0"/>
+    <w:link w:val="a6"/>
     <w:rsid w:val="00A336CE"/>
     <w:rPr>
       <w:sz w:val="24"/>

</xml_diff>

<commit_message>
feat: track broken computer surrender details
</commit_message>
<xml_diff>
--- a/templateActOfAcceptancePC.docx
+++ b/templateActOfAcceptancePC.docx
@@ -556,13 +556,7 @@
         <w:rPr>
           <w:rStyle w:val="a5"/>
         </w:rPr>
-        <w:t>соответствует</w:t>
-      </w:r>
-      <w:r>
-        <w:rPr>
-          <w:rStyle w:val="a5"/>
-        </w:rPr>
-        <w:t xml:space="preserve">: </w:t>
+        <w:t>{conformity}</w:t>
       </w:r>
     </w:p>
     <w:p>

</xml_diff>